<commit_message>
Update audit report: remove frontend-only note and hour estimates
Co-authored-by: kamranakhtar137-prog <kamranakhtar137-prog@users.noreply.github.com>
</commit_message>
<xml_diff>
--- a/shopify-audit/mainstreet_shopify_audit_report.docx
+++ b/shopify-audit/mainstreet_shopify_audit_report.docx
@@ -12,7 +12,7 @@
     </w:p>
     <w:p>
       <w:r>
-        <w:t>Store: https://mainstreetnewcanaan.com/  ·  Frontend-only audit (no admin login)  ·  Location: 102 Main Street, New Canaan CT 06840</w:t>
+        <w:t>Store: https://mainstreetnewcanaan.com/  ·  Location: 102 Main Street, New Canaan CT 06840</w:t>
       </w:r>
     </w:p>
     <w:p>
@@ -20,7 +20,7 @@
         <w:pStyle w:val="Heading1"/>
       </w:pPr>
       <w:r>
-        <w:t>1. In-Store Pickup Configuration  —  5–8 hrs</w:t>
+        <w:t>1. In-Store Pickup Configuration</w:t>
       </w:r>
     </w:p>
     <w:p>
@@ -190,7 +190,7 @@
         <w:pStyle w:val="Heading1"/>
       </w:pPr>
       <w:r>
-        <w:t>2. Store Cleanup  —  9–14 hrs</w:t>
+        <w:t>2. Store Cleanup</w:t>
       </w:r>
     </w:p>
     <w:p>
@@ -474,7 +474,7 @@
         <w:pStyle w:val="Heading1"/>
       </w:pPr>
       <w:r>
-        <w:t>3. Buying Intake Form  —  8–12 hrs</w:t>
+        <w:t>3. Buying Intake Form</w:t>
       </w:r>
     </w:p>
     <w:p>
@@ -629,167 +629,6 @@
           <w:sz w:val="18"/>
         </w:rPr>
         <w:t>Appointment date/time selection (Easy Appointment Booking)</w:t>
-      </w:r>
-    </w:p>
-    <w:p>
-      <w:pPr>
-        <w:pStyle w:val="Heading1"/>
-      </w:pPr>
-      <w:r>
-        <w:t>Totals &amp; Notes</w:t>
-      </w:r>
-    </w:p>
-    <w:tbl>
-      <w:tblPr>
-        <w:tblStyle w:val="LightGrid-Accent1"/>
-        <w:tblW w:type="auto" w:w="0"/>
-        <w:tblLook w:firstColumn="1" w:firstRow="1" w:lastColumn="0" w:lastRow="0" w:noHBand="0" w:noVBand="1" w:val="04A0"/>
-      </w:tblPr>
-      <w:tblGrid>
-        <w:gridCol w:w="4320"/>
-        <w:gridCol w:w="4320"/>
-      </w:tblGrid>
-      <w:tr>
-        <w:tc>
-          <w:tcPr>
-            <w:tcW w:type="dxa" w:w="4320"/>
-          </w:tcPr>
-          <w:p>
-            <w:r>
-              <w:t>Subtask</w:t>
-            </w:r>
-          </w:p>
-        </w:tc>
-        <w:tc>
-          <w:tcPr>
-            <w:tcW w:type="dxa" w:w="4320"/>
-          </w:tcPr>
-          <w:p>
-            <w:r>
-              <w:t>Estimate</w:t>
-            </w:r>
-          </w:p>
-        </w:tc>
-      </w:tr>
-      <w:tr>
-        <w:tc>
-          <w:tcPr>
-            <w:tcW w:type="dxa" w:w="4320"/>
-          </w:tcPr>
-          <w:p>
-            <w:r>
-              <w:t>In-Store Pickup Configuration</w:t>
-            </w:r>
-          </w:p>
-        </w:tc>
-        <w:tc>
-          <w:tcPr>
-            <w:tcW w:type="dxa" w:w="4320"/>
-          </w:tcPr>
-          <w:p>
-            <w:r>
-              <w:t>5–8 hrs</w:t>
-            </w:r>
-          </w:p>
-        </w:tc>
-      </w:tr>
-      <w:tr>
-        <w:tc>
-          <w:tcPr>
-            <w:tcW w:type="dxa" w:w="4320"/>
-          </w:tcPr>
-          <w:p>
-            <w:r>
-              <w:t>Store Cleanup</w:t>
-            </w:r>
-          </w:p>
-        </w:tc>
-        <w:tc>
-          <w:tcPr>
-            <w:tcW w:type="dxa" w:w="4320"/>
-          </w:tcPr>
-          <w:p>
-            <w:r>
-              <w:t>9–14 hrs</w:t>
-            </w:r>
-          </w:p>
-        </w:tc>
-      </w:tr>
-      <w:tr>
-        <w:tc>
-          <w:tcPr>
-            <w:tcW w:type="dxa" w:w="4320"/>
-          </w:tcPr>
-          <w:p>
-            <w:r>
-              <w:t>Buying Intake Form</w:t>
-            </w:r>
-          </w:p>
-        </w:tc>
-        <w:tc>
-          <w:tcPr>
-            <w:tcW w:type="dxa" w:w="4320"/>
-          </w:tcPr>
-          <w:p>
-            <w:r>
-              <w:t>8–12 hrs</w:t>
-            </w:r>
-          </w:p>
-        </w:tc>
-      </w:tr>
-      <w:tr>
-        <w:tc>
-          <w:tcPr>
-            <w:tcW w:type="dxa" w:w="4320"/>
-          </w:tcPr>
-          <w:p>
-            <w:r>
-              <w:t>Full scope</w:t>
-            </w:r>
-          </w:p>
-        </w:tc>
-        <w:tc>
-          <w:tcPr>
-            <w:tcW w:type="dxa" w:w="4320"/>
-          </w:tcPr>
-          <w:p>
-            <w:r>
-              <w:t>22–34 hrs</w:t>
-            </w:r>
-          </w:p>
-        </w:tc>
-      </w:tr>
-    </w:tbl>
-    <w:p>
-      <w:pPr>
-        <w:pStyle w:val="Heading2"/>
-      </w:pPr>
-      <w:r>
-        <w:t>Notes</w:t>
-      </w:r>
-    </w:p>
-    <w:p>
-      <w:pPr>
-        <w:pStyle w:val="ListBullet"/>
-      </w:pPr>
-      <w:r>
-        <w:t>Estimates are development-effort hours, grounded in the findings above.</w:t>
-      </w:r>
-    </w:p>
-    <w:p>
-      <w:pPr>
-        <w:pStyle w:val="ListBullet"/>
-      </w:pPr>
-      <w:r>
-        <w:t>Audit is frontend-only; some settings (inventory-location assignment, checkout/notification config, app data mapping) need admin access to confirm and may shift estimates.</w:t>
-      </w:r>
-    </w:p>
-    <w:p>
-      <w:pPr>
-        <w:pStyle w:val="ListBullet"/>
-      </w:pPr>
-      <w:r>
-        <w:t>Next step after completion: share these findings with the team.</w:t>
       </w:r>
     </w:p>
     <w:sectPr>

</xml_diff>

<commit_message>
Add backend/admin audit findings (pickup, locations, collections, menu, blog, apps)
Co-authored-by: kamranakhtar137-prog <kamranakhtar137-prog@users.noreply.github.com>
</commit_message>
<xml_diff>
--- a/shopify-audit/mainstreet_shopify_audit_report.docx
+++ b/shopify-audit/mainstreet_shopify_audit_report.docx
@@ -53,6 +53,30 @@
       </w:pPr>
       <w:r>
         <w:t>"Store Pickup" nav link points to the "ONLINE STORE" collection (15 products); other collections not verified for pickup / inventory-location assignment.</w:t>
+      </w:r>
+    </w:p>
+    <w:p>
+      <w:pPr>
+        <w:pStyle w:val="Heading2"/>
+      </w:pPr>
+      <w:r>
+        <w:t>Backend (admin) findings</w:t>
+      </w:r>
+    </w:p>
+    <w:p>
+      <w:pPr>
+        <w:pStyle w:val="ListBullet"/>
+      </w:pPr>
+      <w:r>
+        <w:t>Shipping &amp; delivery -&gt; Pickup (102 Main St): Location status is ON, expected pickup date is set to "Usually ready in 24 hours", and a custom ready-for-pickup message is configured ("Bring your photo id along with confirmation email... All orders must match name and photo ID"). Store transfers are unavailable because only one location exists.</w:t>
+      </w:r>
+    </w:p>
+    <w:p>
+      <w:pPr>
+        <w:pStyle w:val="ListBullet"/>
+      </w:pPr>
+      <w:r>
+        <w:t>Locations: using 1 of 10 active locations - 102 Main St (POS Lite, Active). Pickup is correctly tied to this single storefront location; the remaining work is making sure key collections/products are stocked and assigned here and surfacing pickup earlier on product pages.</w:t>
       </w:r>
     </w:p>
     <w:p>
@@ -137,7 +161,7 @@
           <w:i/>
           <w:sz w:val="18"/>
         </w:rPr>
-        <w:t>Checkout delivery showing pickup at 102 Main St (FREE, ready in 24h)</w:t>
+        <w:t>Frontend: checkout delivery showing pickup at 102 Main St (FREE, ready in 24h)</w:t>
       </w:r>
     </w:p>
     <w:p>
@@ -182,7 +206,7 @@
           <w:i/>
           <w:sz w:val="18"/>
         </w:rPr>
-        <w:t>Product page shows only "Available in store only" (no native widget)</w:t>
+        <w:t>Frontend: product page shows only "Available in store only"</w:t>
       </w:r>
     </w:p>
     <w:p>
@@ -214,14 +238,6 @@
         <w:pStyle w:val="ListBullet"/>
       </w:pPr>
       <w:r>
-        <w:t>6 of 7 collections use default Shopify placeholder images; "Baseball" collection is empty (0 products).</w:t>
-      </w:r>
-    </w:p>
-    <w:p>
-      <w:pPr>
-        <w:pStyle w:val="ListBullet"/>
-      </w:pPr>
-      <w:r>
         <w:t>Navigation labeling is confusing ("Store Pickup" → "ONLINE STORE"); no "Shop All" discovery path.</w:t>
       </w:r>
     </w:p>
@@ -231,6 +247,38 @@
       </w:pPr>
       <w:r>
         <w:t>Footer is minimal — no phone/email, hours not repeated, no shipping/FAQ links.</w:t>
+      </w:r>
+    </w:p>
+    <w:p>
+      <w:pPr>
+        <w:pStyle w:val="Heading2"/>
+      </w:pPr>
+      <w:r>
+        <w:t>Backend (admin) findings</w:t>
+      </w:r>
+    </w:p>
+    <w:p>
+      <w:pPr>
+        <w:pStyle w:val="ListBullet"/>
+      </w:pPr>
+      <w:r>
+        <w:t>Collections: admin has 10 collections but the two with real inventory - Sports (1,027 products) and Pokemon (216) - are NOT shown on the site, while several empty ones (GIFT CARDS, WNBA, Basketball, Baseball = 0 products) ARE shown. Frontend shows only: Baseball, Basketball, Consulting, GIFT CARDS, Tcg CARD, ONLINE STORE (15). Recommend hiding/merging the empty collections and surfacing Sports/Pokemon so shoppers can actually browse stock.</w:t>
+      </w:r>
+    </w:p>
+    <w:p>
+      <w:pPr>
+        <w:pStyle w:val="ListBullet"/>
+      </w:pPr>
+      <w:r>
+        <w:t>Main menu: Home, Sell your Cards, Store Pickup, Gift cards, Reviews, Hours and Info, Contact, Trading Card Donations. There is no clear "Shop / All products" entry and "Store Pickup" points to the ONLINE STORE collection - relabel and add a proper shopping path.</w:t>
+      </w:r>
+    </w:p>
+    <w:p>
+      <w:pPr>
+        <w:pStyle w:val="ListBullet"/>
+      </w:pPr>
+      <w:r>
+        <w:t>Content -&gt; Blog posts is empty (no posts). Optional: publish a few posts for SEO/community, or remove any blog links so the storefront stays tidy.</w:t>
       </w:r>
     </w:p>
     <w:p>
@@ -254,15 +302,7 @@
         <w:pStyle w:val="ListBullet"/>
       </w:pPr>
       <w:r>
-        <w:t>Replace 6 placeholder collection images + add collection descriptions.</w:t>
-      </w:r>
-    </w:p>
-    <w:p>
-      <w:pPr>
-        <w:pStyle w:val="ListBullet"/>
-      </w:pPr>
-      <w:r>
-        <w:t>Populate or hide the empty "Baseball" collection.</w:t>
+        <w:t>Hide/merge empty collections (Baseball, Basketball, WNBA, GIFT CARDS) and surface stocked ones (Sports, Pokemon); add collection images + descriptions.</w:t>
       </w:r>
     </w:p>
     <w:p>
@@ -331,7 +371,7 @@
           <w:i/>
           <w:sz w:val="18"/>
         </w:rPr>
-        <w:t>Homepage is sparse (logo + email signup only)</w:t>
+        <w:t>Frontend: homepage is sparse (logo + email signup only)</w:t>
       </w:r>
     </w:p>
     <w:p>
@@ -376,7 +416,103 @@
           <w:i/>
           <w:sz w:val="18"/>
         </w:rPr>
-        <w:t>Collections index — 6/7 use placeholder images</w:t>
+        <w:t>Frontend: collections index</w:t>
+      </w:r>
+    </w:p>
+    <w:p>
+      <w:pPr>
+        <w:pStyle w:val="Heading1"/>
+      </w:pPr>
+      <w:r>
+        <w:t>3. Buying Intake Form</w:t>
+      </w:r>
+    </w:p>
+    <w:p>
+      <w:pPr>
+        <w:pStyle w:val="Heading2"/>
+      </w:pPr>
+      <w:r>
+        <w:t>Current state</w:t>
+      </w:r>
+    </w:p>
+    <w:p>
+      <w:pPr>
+        <w:pStyle w:val="ListBullet"/>
+      </w:pPr>
+      <w:r>
+        <w:t>A structured selling intake ALREADY exists inside the "15 Minute Trading Card Consultation" (Easy Appointment Booking): required field "Please provide a description of your cards and value / asking price" (guides Year, Set, Sport, Condition, Grading Company, Grade, Cert Number, price) + First/Last name, Email, Phone, and date/time picker.</w:t>
+      </w:r>
+    </w:p>
+    <w:p>
+      <w:pPr>
+        <w:pStyle w:val="ListBullet"/>
+      </w:pPr>
+      <w:r>
+        <w:t>Separate generic Contact form (Name, Email, Phone, Comment) — not an intake form.</w:t>
+      </w:r>
+    </w:p>
+    <w:p>
+      <w:pPr>
+        <w:pStyle w:val="Heading2"/>
+      </w:pPr>
+      <w:r>
+        <w:t>Backend (admin) findings</w:t>
+      </w:r>
+    </w:p>
+    <w:p>
+      <w:pPr>
+        <w:pStyle w:val="ListBullet"/>
+      </w:pPr>
+      <w:r>
+        <w:t>8 apps installed: Testimonials Master, Forms, Easy Appointment Booking, Koin, Flow, CardDealerPro, Retail Barcode Labels, Messaging.</w:t>
+      </w:r>
+    </w:p>
+    <w:p>
+      <w:pPr>
+        <w:pStyle w:val="ListBullet"/>
+      </w:pPr>
+      <w:r>
+        <w:t>The intake form can be built with the already-installed Forms + Easy Appointment Booking apps (no new app needed); CardDealerPro (card buying/inventory) and Flow (automation) can route submissions into the existing buying workflow.</w:t>
+      </w:r>
+    </w:p>
+    <w:p>
+      <w:pPr>
+        <w:pStyle w:val="Heading2"/>
+      </w:pPr>
+      <w:r>
+        <w:t>Work remaining (align to buying workflow + better structure)</w:t>
+      </w:r>
+    </w:p>
+    <w:p>
+      <w:pPr>
+        <w:pStyle w:val="ListBullet"/>
+      </w:pPr>
+      <w:r>
+        <w:t>Confirm requirements/workflow with client.</w:t>
+      </w:r>
+    </w:p>
+    <w:p>
+      <w:pPr>
+        <w:pStyle w:val="ListBullet"/>
+      </w:pPr>
+      <w:r>
+        <w:t>Convert the single free-text field into structured inputs (sport dropdown, grading company, grade, cert #, quantity, condition, optional card-image upload) via Easy Appointment Booking custom questions / Forms.</w:t>
+      </w:r>
+    </w:p>
+    <w:p>
+      <w:pPr>
+        <w:pStyle w:val="ListBullet"/>
+      </w:pPr>
+      <w:r>
+        <w:t>Ensure details are captured pre-appointment and land somewhere usable (order notes / metafields / email / CardDealerPro / Flow) — schema + validation.</w:t>
+      </w:r>
+    </w:p>
+    <w:p>
+      <w:pPr>
+        <w:pStyle w:val="ListBullet"/>
+      </w:pPr>
+      <w:r>
+        <w:t>Test end-to-end (incl. edge cases) + client review.</w:t>
       </w:r>
     </w:p>
     <w:p>
@@ -421,214 +557,7 @@
           <w:i/>
           <w:sz w:val="18"/>
         </w:rPr>
-        <w:t>Empty "Baseball" collection (0 products)</w:t>
-      </w:r>
-    </w:p>
-    <w:p>
-      <w:r>
-        <w:drawing>
-          <wp:inline xmlns:a="http://schemas.openxmlformats.org/drawingml/2006/main" xmlns:pic="http://schemas.openxmlformats.org/drawingml/2006/picture">
-            <wp:extent cx="5486400" cy="3429000"/>
-            <wp:docPr id="6" name="Picture 6"/>
-            <wp:cNvGraphicFramePr>
-              <a:graphicFrameLocks noChangeAspect="1"/>
-            </wp:cNvGraphicFramePr>
-            <a:graphic>
-              <a:graphicData uri="http://schemas.openxmlformats.org/drawingml/2006/picture">
-                <pic:pic>
-                  <pic:nvPicPr>
-                    <pic:cNvPr id="0" name="image.png"/>
-                    <pic:cNvPicPr/>
-                  </pic:nvPicPr>
-                  <pic:blipFill>
-                    <a:blip r:embed="rId14"/>
-                    <a:stretch>
-                      <a:fillRect/>
-                    </a:stretch>
-                  </pic:blipFill>
-                  <pic:spPr>
-                    <a:xfrm>
-                      <a:off x="0" y="0"/>
-                      <a:ext cx="5486400" cy="3429000"/>
-                    </a:xfrm>
-                    <a:prstGeom prst="rect"/>
-                  </pic:spPr>
-                </pic:pic>
-              </a:graphicData>
-            </a:graphic>
-          </wp:inline>
-        </w:drawing>
-      </w:r>
-    </w:p>
-    <w:p>
-      <w:r>
-        <w:rPr>
-          <w:i/>
-          <w:sz w:val="18"/>
-        </w:rPr>
-        <w:t>Navigation menu / labeling</w:t>
-      </w:r>
-    </w:p>
-    <w:p>
-      <w:pPr>
-        <w:pStyle w:val="Heading1"/>
-      </w:pPr>
-      <w:r>
-        <w:t>3. Buying Intake Form</w:t>
-      </w:r>
-    </w:p>
-    <w:p>
-      <w:pPr>
-        <w:pStyle w:val="Heading2"/>
-      </w:pPr>
-      <w:r>
-        <w:t>Current state</w:t>
-      </w:r>
-    </w:p>
-    <w:p>
-      <w:pPr>
-        <w:pStyle w:val="ListBullet"/>
-      </w:pPr>
-      <w:r>
-        <w:t>A structured selling intake ALREADY exists inside the "15 Minute Trading Card Consultation" (Easy Appointment Booking): required field "Please provide a description of your cards and value / asking price" (guides Year, Set, Sport, Condition, Grading Company, Grade, Cert Number, price) + First/Last name, Email, Phone, and date/time picker.</w:t>
-      </w:r>
-    </w:p>
-    <w:p>
-      <w:pPr>
-        <w:pStyle w:val="ListBullet"/>
-      </w:pPr>
-      <w:r>
-        <w:t>Separate generic Contact form (Name, Email, Phone, Comment) — not an intake form.</w:t>
-      </w:r>
-    </w:p>
-    <w:p>
-      <w:pPr>
-        <w:pStyle w:val="Heading2"/>
-      </w:pPr>
-      <w:r>
-        <w:t>Work remaining (align to buying workflow + better structure)</w:t>
-      </w:r>
-    </w:p>
-    <w:p>
-      <w:pPr>
-        <w:pStyle w:val="ListBullet"/>
-      </w:pPr>
-      <w:r>
-        <w:t>Confirm requirements/workflow with client.</w:t>
-      </w:r>
-    </w:p>
-    <w:p>
-      <w:pPr>
-        <w:pStyle w:val="ListBullet"/>
-      </w:pPr>
-      <w:r>
-        <w:t>Convert the single free-text field into structured inputs (sport dropdown, grading company, grade, cert #, quantity, condition, optional card-image upload) via Easy Appointment Booking custom questions.</w:t>
-      </w:r>
-    </w:p>
-    <w:p>
-      <w:pPr>
-        <w:pStyle w:val="ListBullet"/>
-      </w:pPr>
-      <w:r>
-        <w:t>Ensure details are captured pre-appointment and land somewhere usable (order notes / metafields / email / export) — schema + validation.</w:t>
-      </w:r>
-    </w:p>
-    <w:p>
-      <w:pPr>
-        <w:pStyle w:val="ListBullet"/>
-      </w:pPr>
-      <w:r>
-        <w:t>Test end-to-end (incl. edge cases) + client review.</w:t>
-      </w:r>
-    </w:p>
-    <w:p>
-      <w:r>
-        <w:drawing>
-          <wp:inline xmlns:a="http://schemas.openxmlformats.org/drawingml/2006/main" xmlns:pic="http://schemas.openxmlformats.org/drawingml/2006/picture">
-            <wp:extent cx="5486400" cy="3429000"/>
-            <wp:docPr id="7" name="Picture 7"/>
-            <wp:cNvGraphicFramePr>
-              <a:graphicFrameLocks noChangeAspect="1"/>
-            </wp:cNvGraphicFramePr>
-            <a:graphic>
-              <a:graphicData uri="http://schemas.openxmlformats.org/drawingml/2006/picture">
-                <pic:pic>
-                  <pic:nvPicPr>
-                    <pic:cNvPr id="0" name="image.png"/>
-                    <pic:cNvPicPr/>
-                  </pic:nvPicPr>
-                  <pic:blipFill>
-                    <a:blip r:embed="rId15"/>
-                    <a:stretch>
-                      <a:fillRect/>
-                    </a:stretch>
-                  </pic:blipFill>
-                  <pic:spPr>
-                    <a:xfrm>
-                      <a:off x="0" y="0"/>
-                      <a:ext cx="5486400" cy="3429000"/>
-                    </a:xfrm>
-                    <a:prstGeom prst="rect"/>
-                  </pic:spPr>
-                </pic:pic>
-              </a:graphicData>
-            </a:graphic>
-          </wp:inline>
-        </w:drawing>
-      </w:r>
-    </w:p>
-    <w:p>
-      <w:r>
-        <w:rPr>
-          <w:i/>
-          <w:sz w:val="18"/>
-        </w:rPr>
-        <w:t>Existing structured intake field inside booking</w:t>
-      </w:r>
-    </w:p>
-    <w:p>
-      <w:r>
-        <w:drawing>
-          <wp:inline xmlns:a="http://schemas.openxmlformats.org/drawingml/2006/main" xmlns:pic="http://schemas.openxmlformats.org/drawingml/2006/picture">
-            <wp:extent cx="5486400" cy="3429000"/>
-            <wp:docPr id="8" name="Picture 8"/>
-            <wp:cNvGraphicFramePr>
-              <a:graphicFrameLocks noChangeAspect="1"/>
-            </wp:cNvGraphicFramePr>
-            <a:graphic>
-              <a:graphicData uri="http://schemas.openxmlformats.org/drawingml/2006/picture">
-                <pic:pic>
-                  <pic:nvPicPr>
-                    <pic:cNvPr id="0" name="image.png"/>
-                    <pic:cNvPicPr/>
-                  </pic:nvPicPr>
-                  <pic:blipFill>
-                    <a:blip r:embed="rId16"/>
-                    <a:stretch>
-                      <a:fillRect/>
-                    </a:stretch>
-                  </pic:blipFill>
-                  <pic:spPr>
-                    <a:xfrm>
-                      <a:off x="0" y="0"/>
-                      <a:ext cx="5486400" cy="3429000"/>
-                    </a:xfrm>
-                    <a:prstGeom prst="rect"/>
-                  </pic:spPr>
-                </pic:pic>
-              </a:graphicData>
-            </a:graphic>
-          </wp:inline>
-        </w:drawing>
-      </w:r>
-    </w:p>
-    <w:p>
-      <w:r>
-        <w:rPr>
-          <w:i/>
-          <w:sz w:val="18"/>
-        </w:rPr>
-        <w:t>Appointment date/time selection (Easy Appointment Booking)</w:t>
+        <w:t>Frontend: existing structured intake field inside booking</w:t>
       </w:r>
     </w:p>
     <w:sectPr>

</xml_diff>

<commit_message>
Embed backend/admin screenshots into audit report (pickup, locations, collections, menu, blog, apps)
Co-authored-by: kamranakhtar137-prog <kamranakhtar137-prog@users.noreply.github.com>
</commit_message>
<xml_diff>
--- a/shopify-audit/mainstreet_shopify_audit_report.docx
+++ b/shopify-audit/mainstreet_shopify_audit_report.docx
@@ -210,6 +210,96 @@
       </w:r>
     </w:p>
     <w:p>
+      <w:r>
+        <w:drawing>
+          <wp:inline xmlns:a="http://schemas.openxmlformats.org/drawingml/2006/main" xmlns:pic="http://schemas.openxmlformats.org/drawingml/2006/picture">
+            <wp:extent cx="5486400" cy="3153693"/>
+            <wp:docPr id="3" name="Picture 3"/>
+            <wp:cNvGraphicFramePr>
+              <a:graphicFrameLocks noChangeAspect="1"/>
+            </wp:cNvGraphicFramePr>
+            <a:graphic>
+              <a:graphicData uri="http://schemas.openxmlformats.org/drawingml/2006/picture">
+                <pic:pic>
+                  <pic:nvPicPr>
+                    <pic:cNvPr id="0" name="image.png"/>
+                    <pic:cNvPicPr/>
+                  </pic:nvPicPr>
+                  <pic:blipFill>
+                    <a:blip r:embed="rId11"/>
+                    <a:stretch>
+                      <a:fillRect/>
+                    </a:stretch>
+                  </pic:blipFill>
+                  <pic:spPr>
+                    <a:xfrm>
+                      <a:off x="0" y="0"/>
+                      <a:ext cx="5486400" cy="3153693"/>
+                    </a:xfrm>
+                    <a:prstGeom prst="rect"/>
+                  </pic:spPr>
+                </pic:pic>
+              </a:graphicData>
+            </a:graphic>
+          </wp:inline>
+        </w:drawing>
+      </w:r>
+    </w:p>
+    <w:p>
+      <w:r>
+        <w:rPr>
+          <w:i/>
+          <w:sz w:val="18"/>
+        </w:rPr>
+        <w:t>Backend: In-store pickup for 102 Main St - status ON, ready in 24h, ready-for-pickup message</w:t>
+      </w:r>
+    </w:p>
+    <w:p>
+      <w:r>
+        <w:drawing>
+          <wp:inline xmlns:a="http://schemas.openxmlformats.org/drawingml/2006/main" xmlns:pic="http://schemas.openxmlformats.org/drawingml/2006/picture">
+            <wp:extent cx="5486400" cy="3233201"/>
+            <wp:docPr id="4" name="Picture 4"/>
+            <wp:cNvGraphicFramePr>
+              <a:graphicFrameLocks noChangeAspect="1"/>
+            </wp:cNvGraphicFramePr>
+            <a:graphic>
+              <a:graphicData uri="http://schemas.openxmlformats.org/drawingml/2006/picture">
+                <pic:pic>
+                  <pic:nvPicPr>
+                    <pic:cNvPr id="0" name="image.png"/>
+                    <pic:cNvPicPr/>
+                  </pic:nvPicPr>
+                  <pic:blipFill>
+                    <a:blip r:embed="rId12"/>
+                    <a:stretch>
+                      <a:fillRect/>
+                    </a:stretch>
+                  </pic:blipFill>
+                  <pic:spPr>
+                    <a:xfrm>
+                      <a:off x="0" y="0"/>
+                      <a:ext cx="5486400" cy="3233201"/>
+                    </a:xfrm>
+                    <a:prstGeom prst="rect"/>
+                  </pic:spPr>
+                </pic:pic>
+              </a:graphicData>
+            </a:graphic>
+          </wp:inline>
+        </w:drawing>
+      </w:r>
+    </w:p>
+    <w:p>
+      <w:r>
+        <w:rPr>
+          <w:i/>
+          <w:sz w:val="18"/>
+        </w:rPr>
+        <w:t>Backend: Locations - 1 of 10 active; 102 Main St (POS Lite, Active)</w:t>
+      </w:r>
+    </w:p>
+    <w:p>
       <w:pPr>
         <w:pStyle w:val="Heading1"/>
       </w:pPr>
@@ -334,7 +424,7 @@
         <w:drawing>
           <wp:inline xmlns:a="http://schemas.openxmlformats.org/drawingml/2006/main" xmlns:pic="http://schemas.openxmlformats.org/drawingml/2006/picture">
             <wp:extent cx="5486400" cy="3429000"/>
-            <wp:docPr id="3" name="Picture 3"/>
+            <wp:docPr id="5" name="Picture 5"/>
             <wp:cNvGraphicFramePr>
               <a:graphicFrameLocks noChangeAspect="1"/>
             </wp:cNvGraphicFramePr>
@@ -346,7 +436,7 @@
                     <pic:cNvPicPr/>
                   </pic:nvPicPr>
                   <pic:blipFill>
-                    <a:blip r:embed="rId11"/>
+                    <a:blip r:embed="rId13"/>
                     <a:stretch>
                       <a:fillRect/>
                     </a:stretch>
@@ -379,7 +469,7 @@
         <w:drawing>
           <wp:inline xmlns:a="http://schemas.openxmlformats.org/drawingml/2006/main" xmlns:pic="http://schemas.openxmlformats.org/drawingml/2006/picture">
             <wp:extent cx="5486400" cy="3429000"/>
-            <wp:docPr id="4" name="Picture 4"/>
+            <wp:docPr id="6" name="Picture 6"/>
             <wp:cNvGraphicFramePr>
               <a:graphicFrameLocks noChangeAspect="1"/>
             </wp:cNvGraphicFramePr>
@@ -391,7 +481,7 @@
                     <pic:cNvPicPr/>
                   </pic:nvPicPr>
                   <pic:blipFill>
-                    <a:blip r:embed="rId12"/>
+                    <a:blip r:embed="rId14"/>
                     <a:stretch>
                       <a:fillRect/>
                     </a:stretch>
@@ -417,6 +507,141 @@
           <w:sz w:val="18"/>
         </w:rPr>
         <w:t>Frontend: collections index</w:t>
+      </w:r>
+    </w:p>
+    <w:p>
+      <w:r>
+        <w:drawing>
+          <wp:inline xmlns:a="http://schemas.openxmlformats.org/drawingml/2006/main" xmlns:pic="http://schemas.openxmlformats.org/drawingml/2006/picture">
+            <wp:extent cx="5486400" cy="2530192"/>
+            <wp:docPr id="7" name="Picture 7"/>
+            <wp:cNvGraphicFramePr>
+              <a:graphicFrameLocks noChangeAspect="1"/>
+            </wp:cNvGraphicFramePr>
+            <a:graphic>
+              <a:graphicData uri="http://schemas.openxmlformats.org/drawingml/2006/picture">
+                <pic:pic>
+                  <pic:nvPicPr>
+                    <pic:cNvPr id="0" name="image.png"/>
+                    <pic:cNvPicPr/>
+                  </pic:nvPicPr>
+                  <pic:blipFill>
+                    <a:blip r:embed="rId15"/>
+                    <a:stretch>
+                      <a:fillRect/>
+                    </a:stretch>
+                  </pic:blipFill>
+                  <pic:spPr>
+                    <a:xfrm>
+                      <a:off x="0" y="0"/>
+                      <a:ext cx="5486400" cy="2530192"/>
+                    </a:xfrm>
+                    <a:prstGeom prst="rect"/>
+                  </pic:spPr>
+                </pic:pic>
+              </a:graphicData>
+            </a:graphic>
+          </wp:inline>
+        </w:drawing>
+      </w:r>
+    </w:p>
+    <w:p>
+      <w:r>
+        <w:rPr>
+          <w:i/>
+          <w:sz w:val="18"/>
+        </w:rPr>
+        <w:t>Backend: Collections - stocked Sports (1,027) &amp; Pokemon (216) hidden; empty collections shown</w:t>
+      </w:r>
+    </w:p>
+    <w:p>
+      <w:r>
+        <w:drawing>
+          <wp:inline xmlns:a="http://schemas.openxmlformats.org/drawingml/2006/main" xmlns:pic="http://schemas.openxmlformats.org/drawingml/2006/picture">
+            <wp:extent cx="5486400" cy="2560320"/>
+            <wp:docPr id="8" name="Picture 8"/>
+            <wp:cNvGraphicFramePr>
+              <a:graphicFrameLocks noChangeAspect="1"/>
+            </wp:cNvGraphicFramePr>
+            <a:graphic>
+              <a:graphicData uri="http://schemas.openxmlformats.org/drawingml/2006/picture">
+                <pic:pic>
+                  <pic:nvPicPr>
+                    <pic:cNvPr id="0" name="image.png"/>
+                    <pic:cNvPicPr/>
+                  </pic:nvPicPr>
+                  <pic:blipFill>
+                    <a:blip r:embed="rId16"/>
+                    <a:stretch>
+                      <a:fillRect/>
+                    </a:stretch>
+                  </pic:blipFill>
+                  <pic:spPr>
+                    <a:xfrm>
+                      <a:off x="0" y="0"/>
+                      <a:ext cx="5486400" cy="2560320"/>
+                    </a:xfrm>
+                    <a:prstGeom prst="rect"/>
+                  </pic:spPr>
+                </pic:pic>
+              </a:graphicData>
+            </a:graphic>
+          </wp:inline>
+        </w:drawing>
+      </w:r>
+    </w:p>
+    <w:p>
+      <w:r>
+        <w:rPr>
+          <w:i/>
+          <w:sz w:val="18"/>
+        </w:rPr>
+        <w:t>Backend: Main menu items</w:t>
+      </w:r>
+    </w:p>
+    <w:p>
+      <w:r>
+        <w:drawing>
+          <wp:inline xmlns:a="http://schemas.openxmlformats.org/drawingml/2006/main" xmlns:pic="http://schemas.openxmlformats.org/drawingml/2006/picture">
+            <wp:extent cx="5486400" cy="2360088"/>
+            <wp:docPr id="9" name="Picture 9"/>
+            <wp:cNvGraphicFramePr>
+              <a:graphicFrameLocks noChangeAspect="1"/>
+            </wp:cNvGraphicFramePr>
+            <a:graphic>
+              <a:graphicData uri="http://schemas.openxmlformats.org/drawingml/2006/picture">
+                <pic:pic>
+                  <pic:nvPicPr>
+                    <pic:cNvPr id="0" name="image.png"/>
+                    <pic:cNvPicPr/>
+                  </pic:nvPicPr>
+                  <pic:blipFill>
+                    <a:blip r:embed="rId17"/>
+                    <a:stretch>
+                      <a:fillRect/>
+                    </a:stretch>
+                  </pic:blipFill>
+                  <pic:spPr>
+                    <a:xfrm>
+                      <a:off x="0" y="0"/>
+                      <a:ext cx="5486400" cy="2360088"/>
+                    </a:xfrm>
+                    <a:prstGeom prst="rect"/>
+                  </pic:spPr>
+                </pic:pic>
+              </a:graphicData>
+            </a:graphic>
+          </wp:inline>
+        </w:drawing>
+      </w:r>
+    </w:p>
+    <w:p>
+      <w:r>
+        <w:rPr>
+          <w:i/>
+          <w:sz w:val="18"/>
+        </w:rPr>
+        <w:t>Backend: Blog posts - none published</w:t>
       </w:r>
     </w:p>
     <w:p>
@@ -520,7 +745,7 @@
         <w:drawing>
           <wp:inline xmlns:a="http://schemas.openxmlformats.org/drawingml/2006/main" xmlns:pic="http://schemas.openxmlformats.org/drawingml/2006/picture">
             <wp:extent cx="5486400" cy="3429000"/>
-            <wp:docPr id="5" name="Picture 5"/>
+            <wp:docPr id="10" name="Picture 10"/>
             <wp:cNvGraphicFramePr>
               <a:graphicFrameLocks noChangeAspect="1"/>
             </wp:cNvGraphicFramePr>
@@ -532,7 +757,7 @@
                     <pic:cNvPicPr/>
                   </pic:nvPicPr>
                   <pic:blipFill>
-                    <a:blip r:embed="rId13"/>
+                    <a:blip r:embed="rId18"/>
                     <a:stretch>
                       <a:fillRect/>
                     </a:stretch>
@@ -558,6 +783,51 @@
           <w:sz w:val="18"/>
         </w:rPr>
         <w:t>Frontend: existing structured intake field inside booking</w:t>
+      </w:r>
+    </w:p>
+    <w:p>
+      <w:r>
+        <w:drawing>
+          <wp:inline xmlns:a="http://schemas.openxmlformats.org/drawingml/2006/main" xmlns:pic="http://schemas.openxmlformats.org/drawingml/2006/picture">
+            <wp:extent cx="5486400" cy="2725593"/>
+            <wp:docPr id="11" name="Picture 11"/>
+            <wp:cNvGraphicFramePr>
+              <a:graphicFrameLocks noChangeAspect="1"/>
+            </wp:cNvGraphicFramePr>
+            <a:graphic>
+              <a:graphicData uri="http://schemas.openxmlformats.org/drawingml/2006/picture">
+                <pic:pic>
+                  <pic:nvPicPr>
+                    <pic:cNvPr id="0" name="image.png"/>
+                    <pic:cNvPicPr/>
+                  </pic:nvPicPr>
+                  <pic:blipFill>
+                    <a:blip r:embed="rId19"/>
+                    <a:stretch>
+                      <a:fillRect/>
+                    </a:stretch>
+                  </pic:blipFill>
+                  <pic:spPr>
+                    <a:xfrm>
+                      <a:off x="0" y="0"/>
+                      <a:ext cx="5486400" cy="2725593"/>
+                    </a:xfrm>
+                    <a:prstGeom prst="rect"/>
+                  </pic:spPr>
+                </pic:pic>
+              </a:graphicData>
+            </a:graphic>
+          </wp:inline>
+        </w:drawing>
+      </w:r>
+    </w:p>
+    <w:p>
+      <w:r>
+        <w:rPr>
+          <w:i/>
+          <w:sz w:val="18"/>
+        </w:rPr>
+        <w:t>Backend: installed apps (Forms, Easy Appointment Booking, CardDealerPro, Flow, ...)</w:t>
       </w:r>
     </w:p>
     <w:sectPr>

</xml_diff>

<commit_message>
Itemize backend data (apps, collections, menu) into separate list entries
Co-authored-by: kamranakhtar137-prog <kamranakhtar137-prog@users.noreply.github.com>
</commit_message>
<xml_diff>
--- a/shopify-audit/mainstreet_shopify_audit_report.docx
+++ b/shopify-audit/mainstreet_shopify_audit_report.docx
@@ -68,7 +68,39 @@
         <w:pStyle w:val="ListBullet"/>
       </w:pPr>
       <w:r>
-        <w:t>Shipping &amp; delivery -&gt; Pickup (102 Main St): Location status is ON, expected pickup date is set to "Usually ready in 24 hours", and a custom ready-for-pickup message is configured ("Bring your photo id along with confirmation email... All orders must match name and photo ID"). Store transfers are unavailable because only one location exists.</w:t>
+        <w:t>Shipping &amp; delivery -&gt; Pickup (102 Main St):</w:t>
+      </w:r>
+    </w:p>
+    <w:p>
+      <w:pPr>
+        <w:pStyle w:val="ListBullet2"/>
+      </w:pPr>
+      <w:r>
+        <w:t>Location status: ON (customers can pick up orders at this location).</w:t>
+      </w:r>
+    </w:p>
+    <w:p>
+      <w:pPr>
+        <w:pStyle w:val="ListBullet2"/>
+      </w:pPr>
+      <w:r>
+        <w:t>Expected pickup date: "Usually ready in 24 hours".</w:t>
+      </w:r>
+    </w:p>
+    <w:p>
+      <w:pPr>
+        <w:pStyle w:val="ListBullet2"/>
+      </w:pPr>
+      <w:r>
+        <w:t>Ready-for-pickup notification: custom message set - "Bring your photo id along with confirmation email when you come to collect your order. All orders must match name and photo ID".</w:t>
+      </w:r>
+    </w:p>
+    <w:p>
+      <w:pPr>
+        <w:pStyle w:val="ListBullet2"/>
+      </w:pPr>
+      <w:r>
+        <w:t>Store transfers: unavailable (requires multiple active locations).</w:t>
       </w:r>
     </w:p>
     <w:p>
@@ -76,7 +108,23 @@
         <w:pStyle w:val="ListBullet"/>
       </w:pPr>
       <w:r>
-        <w:t>Locations: using 1 of 10 active locations - 102 Main St (POS Lite, Active). Pickup is correctly tied to this single storefront location; the remaining work is making sure key collections/products are stocked and assigned here and surfacing pickup earlier on product pages.</w:t>
+        <w:t>Locations:</w:t>
+      </w:r>
+    </w:p>
+    <w:p>
+      <w:pPr>
+        <w:pStyle w:val="ListBullet2"/>
+      </w:pPr>
+      <w:r>
+        <w:t>Using 1 of 10 active locations.</w:t>
+      </w:r>
+    </w:p>
+    <w:p>
+      <w:pPr>
+        <w:pStyle w:val="ListBullet2"/>
+      </w:pPr>
+      <w:r>
+        <w:t>102 Main St - POS subscription: POS Lite - Status: Active.</w:t>
       </w:r>
     </w:p>
     <w:p>
@@ -352,7 +400,95 @@
         <w:pStyle w:val="ListBullet"/>
       </w:pPr>
       <w:r>
-        <w:t>Collections: admin has 10 collections but the two with real inventory - Sports (1,027 products) and Pokemon (216) - are NOT shown on the site, while several empty ones (GIFT CARDS, WNBA, Basketball, Baseball = 0 products) ARE shown. Frontend shows only: Baseball, Basketball, Consulting, GIFT CARDS, Tcg CARD, ONLINE STORE (15). Recommend hiding/merging the empty collections and surfacing Sports/Pokemon so shoppers can actually browse stock.</w:t>
+        <w:t>Collections (admin) - product count and whether shown on the website:</w:t>
+      </w:r>
+    </w:p>
+    <w:p>
+      <w:pPr>
+        <w:pStyle w:val="ListBullet2"/>
+      </w:pPr>
+      <w:r>
+        <w:t>ONLINE STORE - 15 products - shown on site.</w:t>
+      </w:r>
+    </w:p>
+    <w:p>
+      <w:pPr>
+        <w:pStyle w:val="ListBullet2"/>
+      </w:pPr>
+      <w:r>
+        <w:t>Sports - 1,027 products (auto: title does not contain Pokemon) - NOT shown on site.</w:t>
+      </w:r>
+    </w:p>
+    <w:p>
+      <w:pPr>
+        <w:pStyle w:val="ListBullet2"/>
+      </w:pPr>
+      <w:r>
+        <w:t>Pokemon - 216 products (auto: title contains Pokemon) - NOT shown on site.</w:t>
+      </w:r>
+    </w:p>
+    <w:p>
+      <w:pPr>
+        <w:pStyle w:val="ListBullet2"/>
+      </w:pPr>
+      <w:r>
+        <w:t>Consulting - 1 product - shown on site.</w:t>
+      </w:r>
+    </w:p>
+    <w:p>
+      <w:pPr>
+        <w:pStyle w:val="ListBullet2"/>
+      </w:pPr>
+      <w:r>
+        <w:t>Tcg CARD - 1 product - shown on site.</w:t>
+      </w:r>
+    </w:p>
+    <w:p>
+      <w:pPr>
+        <w:pStyle w:val="ListBullet2"/>
+      </w:pPr>
+      <w:r>
+        <w:t>Tcg - 1 product - not shown on site.</w:t>
+      </w:r>
+    </w:p>
+    <w:p>
+      <w:pPr>
+        <w:pStyle w:val="ListBullet2"/>
+      </w:pPr>
+      <w:r>
+        <w:t>GIFT CARDS - 0 products (empty) - shown on site.</w:t>
+      </w:r>
+    </w:p>
+    <w:p>
+      <w:pPr>
+        <w:pStyle w:val="ListBullet2"/>
+      </w:pPr>
+      <w:r>
+        <w:t>WNBA - 0 products (empty) - shown on site.</w:t>
+      </w:r>
+    </w:p>
+    <w:p>
+      <w:pPr>
+        <w:pStyle w:val="ListBullet2"/>
+      </w:pPr>
+      <w:r>
+        <w:t>Basketball - 0 products (empty) - shown on site.</w:t>
+      </w:r>
+    </w:p>
+    <w:p>
+      <w:pPr>
+        <w:pStyle w:val="ListBullet2"/>
+      </w:pPr>
+      <w:r>
+        <w:t>Baseball - 0 products (empty) - shown on site.</w:t>
+      </w:r>
+    </w:p>
+    <w:p>
+      <w:pPr>
+        <w:pStyle w:val="ListBullet2"/>
+      </w:pPr>
+      <w:r>
+        <w:t>Issue: the two collections that actually hold inventory (Sports, Pokemon) are hidden, while four empty collections are shown. Hide/merge the empty ones and surface Sports/Pokemon.</w:t>
       </w:r>
     </w:p>
     <w:p>
@@ -360,7 +496,79 @@
         <w:pStyle w:val="ListBullet"/>
       </w:pPr>
       <w:r>
-        <w:t>Main menu: Home, Sell your Cards, Store Pickup, Gift cards, Reviews, Hours and Info, Contact, Trading Card Donations. There is no clear "Shop / All products" entry and "Store Pickup" points to the ONLINE STORE collection - relabel and add a proper shopping path.</w:t>
+        <w:t>Main menu items:</w:t>
+      </w:r>
+    </w:p>
+    <w:p>
+      <w:pPr>
+        <w:pStyle w:val="ListBullet2"/>
+      </w:pPr>
+      <w:r>
+        <w:t>Home</w:t>
+      </w:r>
+    </w:p>
+    <w:p>
+      <w:pPr>
+        <w:pStyle w:val="ListBullet2"/>
+      </w:pPr>
+      <w:r>
+        <w:t>Sell your Cards</w:t>
+      </w:r>
+    </w:p>
+    <w:p>
+      <w:pPr>
+        <w:pStyle w:val="ListBullet2"/>
+      </w:pPr>
+      <w:r>
+        <w:t>Store Pickup</w:t>
+      </w:r>
+    </w:p>
+    <w:p>
+      <w:pPr>
+        <w:pStyle w:val="ListBullet2"/>
+      </w:pPr>
+      <w:r>
+        <w:t>Gift cards</w:t>
+      </w:r>
+    </w:p>
+    <w:p>
+      <w:pPr>
+        <w:pStyle w:val="ListBullet2"/>
+      </w:pPr>
+      <w:r>
+        <w:t>Reviews</w:t>
+      </w:r>
+    </w:p>
+    <w:p>
+      <w:pPr>
+        <w:pStyle w:val="ListBullet2"/>
+      </w:pPr>
+      <w:r>
+        <w:t>Hours and Info</w:t>
+      </w:r>
+    </w:p>
+    <w:p>
+      <w:pPr>
+        <w:pStyle w:val="ListBullet2"/>
+      </w:pPr>
+      <w:r>
+        <w:t>Contact</w:t>
+      </w:r>
+    </w:p>
+    <w:p>
+      <w:pPr>
+        <w:pStyle w:val="ListBullet2"/>
+      </w:pPr>
+      <w:r>
+        <w:t>Trading Card Donations</w:t>
+      </w:r>
+    </w:p>
+    <w:p>
+      <w:pPr>
+        <w:pStyle w:val="ListBullet2"/>
+      </w:pPr>
+      <w:r>
+        <w:t>Note: no clear "Shop / All products" entry, and "Store Pickup" points to the ONLINE STORE collection - relabel and add a proper shopping path.</w:t>
       </w:r>
     </w:p>
     <w:p>
@@ -368,7 +576,23 @@
         <w:pStyle w:val="ListBullet"/>
       </w:pPr>
       <w:r>
-        <w:t>Content -&gt; Blog posts is empty (no posts). Optional: publish a few posts for SEO/community, or remove any blog links so the storefront stays tidy.</w:t>
+        <w:t>Content -&gt; Blog posts:</w:t>
+      </w:r>
+    </w:p>
+    <w:p>
+      <w:pPr>
+        <w:pStyle w:val="ListBullet2"/>
+      </w:pPr>
+      <w:r>
+        <w:t>No blog posts published.</w:t>
+      </w:r>
+    </w:p>
+    <w:p>
+      <w:pPr>
+        <w:pStyle w:val="ListBullet2"/>
+      </w:pPr>
+      <w:r>
+        <w:t>Optional: publish a few posts for SEO/community, or remove blog links so the storefront stays tidy.</w:t>
       </w:r>
     </w:p>
     <w:p>
@@ -665,7 +889,39 @@
         <w:pStyle w:val="ListBullet"/>
       </w:pPr>
       <w:r>
-        <w:t>A structured selling intake ALREADY exists inside the "15 Minute Trading Card Consultation" (Easy Appointment Booking): required field "Please provide a description of your cards and value / asking price" (guides Year, Set, Sport, Condition, Grading Company, Grade, Cert Number, price) + First/Last name, Email, Phone, and date/time picker.</w:t>
+        <w:t>A structured selling intake ALREADY exists inside the "15 Minute Trading Card Consultation" (Easy Appointment Booking).</w:t>
+      </w:r>
+    </w:p>
+    <w:p>
+      <w:pPr>
+        <w:pStyle w:val="ListBullet"/>
+      </w:pPr>
+      <w:r>
+        <w:t>The booking currently collects:</w:t>
+      </w:r>
+    </w:p>
+    <w:p>
+      <w:pPr>
+        <w:pStyle w:val="ListBullet2"/>
+      </w:pPr>
+      <w:r>
+        <w:t>Card details (required free-text): "Please provide a description of your cards and value / asking price" - guides Year, Set, Sport, Condition, Grading Company, Grade, Cert Number, price.</w:t>
+      </w:r>
+    </w:p>
+    <w:p>
+      <w:pPr>
+        <w:pStyle w:val="ListBullet2"/>
+      </w:pPr>
+      <w:r>
+        <w:t>First name, Last name, Email, Phone.</w:t>
+      </w:r>
+    </w:p>
+    <w:p>
+      <w:pPr>
+        <w:pStyle w:val="ListBullet2"/>
+      </w:pPr>
+      <w:r>
+        <w:t>Appointment date/time (15-minute slots).</w:t>
       </w:r>
     </w:p>
     <w:p>
@@ -689,7 +945,71 @@
         <w:pStyle w:val="ListBullet"/>
       </w:pPr>
       <w:r>
-        <w:t>8 apps installed: Testimonials Master, Forms, Easy Appointment Booking, Koin, Flow, CardDealerPro, Retail Barcode Labels, Messaging.</w:t>
+        <w:t>Installed apps (8):</w:t>
+      </w:r>
+    </w:p>
+    <w:p>
+      <w:pPr>
+        <w:pStyle w:val="ListBullet2"/>
+      </w:pPr>
+      <w:r>
+        <w:t>Testimonials Master - collects/displays customer testimonials.</w:t>
+      </w:r>
+    </w:p>
+    <w:p>
+      <w:pPr>
+        <w:pStyle w:val="ListBullet2"/>
+      </w:pPr>
+      <w:r>
+        <w:t>Forms - build custom forms (can power a structured selling intake form).</w:t>
+      </w:r>
+    </w:p>
+    <w:p>
+      <w:pPr>
+        <w:pStyle w:val="ListBullet2"/>
+      </w:pPr>
+      <w:r>
+        <w:t>Easy Appointment Booking - runs the consultation scheduling + intake question (core of the buying workflow).</w:t>
+      </w:r>
+    </w:p>
+    <w:p>
+      <w:pPr>
+        <w:pStyle w:val="ListBullet2"/>
+      </w:pPr>
+      <w:r>
+        <w:t>Koin - store credit / loyalty (role to confirm in admin).</w:t>
+      </w:r>
+    </w:p>
+    <w:p>
+      <w:pPr>
+        <w:pStyle w:val="ListBullet2"/>
+      </w:pPr>
+      <w:r>
+        <w:t>Flow - Shopify automation (can route/notify on new intake submissions).</w:t>
+      </w:r>
+    </w:p>
+    <w:p>
+      <w:pPr>
+        <w:pStyle w:val="ListBullet2"/>
+      </w:pPr>
+      <w:r>
+        <w:t>CardDealerPro - trading-card buying / inventory management.</w:t>
+      </w:r>
+    </w:p>
+    <w:p>
+      <w:pPr>
+        <w:pStyle w:val="ListBullet2"/>
+      </w:pPr>
+      <w:r>
+        <w:t>Retail Barcode Labels - POS barcode label printing.</w:t>
+      </w:r>
+    </w:p>
+    <w:p>
+      <w:pPr>
+        <w:pStyle w:val="ListBullet2"/>
+      </w:pPr>
+      <w:r>
+        <w:t>Messaging - customer messaging / inbox.</w:t>
       </w:r>
     </w:p>
     <w:p>
@@ -697,7 +1017,7 @@
         <w:pStyle w:val="ListBullet"/>
       </w:pPr>
       <w:r>
-        <w:t>The intake form can be built with the already-installed Forms + Easy Appointment Booking apps (no new app needed); CardDealerPro (card buying/inventory) and Flow (automation) can route submissions into the existing buying workflow.</w:t>
+        <w:t>Relevant to the intake form: Forms + Easy Appointment Booking can build it (no new app needed); CardDealerPro and Flow can route submissions into the existing buying workflow.</w:t>
       </w:r>
     </w:p>
     <w:p>
@@ -721,7 +1041,63 @@
         <w:pStyle w:val="ListBullet"/>
       </w:pPr>
       <w:r>
-        <w:t>Convert the single free-text field into structured inputs (sport dropdown, grading company, grade, cert #, quantity, condition, optional card-image upload) via Easy Appointment Booking custom questions / Forms.</w:t>
+        <w:t>Convert the single free-text field into structured inputs via Easy Appointment Booking custom questions / Forms:</w:t>
+      </w:r>
+    </w:p>
+    <w:p>
+      <w:pPr>
+        <w:pStyle w:val="ListBullet2"/>
+      </w:pPr>
+      <w:r>
+        <w:t>Sport (dropdown)</w:t>
+      </w:r>
+    </w:p>
+    <w:p>
+      <w:pPr>
+        <w:pStyle w:val="ListBullet2"/>
+      </w:pPr>
+      <w:r>
+        <w:t>Grading company (dropdown: PSA / BGS / SGC / CGC / Raw)</w:t>
+      </w:r>
+    </w:p>
+    <w:p>
+      <w:pPr>
+        <w:pStyle w:val="ListBullet2"/>
+      </w:pPr>
+      <w:r>
+        <w:t>Grade</w:t>
+      </w:r>
+    </w:p>
+    <w:p>
+      <w:pPr>
+        <w:pStyle w:val="ListBullet2"/>
+      </w:pPr>
+      <w:r>
+        <w:t>Cert number</w:t>
+      </w:r>
+    </w:p>
+    <w:p>
+      <w:pPr>
+        <w:pStyle w:val="ListBullet2"/>
+      </w:pPr>
+      <w:r>
+        <w:t>Quantity</w:t>
+      </w:r>
+    </w:p>
+    <w:p>
+      <w:pPr>
+        <w:pStyle w:val="ListBullet2"/>
+      </w:pPr>
+      <w:r>
+        <w:t>Condition</w:t>
+      </w:r>
+    </w:p>
+    <w:p>
+      <w:pPr>
+        <w:pStyle w:val="ListBullet2"/>
+      </w:pPr>
+      <w:r>
+        <w:t>Optional card-image upload</w:t>
       </w:r>
     </w:p>
     <w:p>

</xml_diff>